<commit_message>
New run to add Evidently data
</commit_message>
<xml_diff>
--- a/report/FINAL/noted_platform_user_manual.docx
+++ b/report/FINAL/noted_platform_user_manual.docx
@@ -11,15 +11,15 @@
           <w:sz w:val="32"/>
         </w:rPr>
         <w:drawing>
-          <wp:anchor distT="0" distB="0" distL="114300" distR="114300" simplePos="0" relativeHeight="251658240" behindDoc="0" locked="0" layoutInCell="1" allowOverlap="1" wp14:anchorId="01D40A70" wp14:editId="5BC40EF8">
+          <wp:anchor distT="0" distB="0" distL="114300" distR="114300" simplePos="0" relativeHeight="251658240" behindDoc="0" locked="0" layoutInCell="1" allowOverlap="1" wp14:anchorId="01D40A70" wp14:editId="7D1FC20B">
             <wp:simplePos x="0" y="0"/>
             <wp:positionH relativeFrom="column">
               <wp:posOffset>-933450</wp:posOffset>
             </wp:positionH>
             <wp:positionV relativeFrom="page">
-              <wp:posOffset>-12700</wp:posOffset>
+              <wp:posOffset>-9525</wp:posOffset>
             </wp:positionV>
-            <wp:extent cx="7568558" cy="10744200"/>
+            <wp:extent cx="7620000" cy="10743308"/>
             <wp:effectExtent l="0" t="0" r="0" b="0"/>
             <wp:wrapNone/>
             <wp:docPr id="975908266" name="Picture 1"/>
@@ -48,7 +48,7 @@
                   <pic:spPr>
                     <a:xfrm>
                       <a:off x="0" y="0"/>
-                      <a:ext cx="7581214" cy="10762166"/>
+                      <a:ext cx="7634988" cy="10764440"/>
                     </a:xfrm>
                     <a:prstGeom prst="rect">
                       <a:avLst/>

</xml_diff>